<commit_message>
No PAP Designer in PDF
</commit_message>
<xml_diff>
--- a/08_Arrays/Übungen/Eratosthenes/SiebDesEratosthenes.docx
+++ b/08_Arrays/Übungen/Eratosthenes/SiebDesEratosthenes.docx
@@ -1,6 +1,6 @@
 
 <file path=word/document.xml><?xml version="1.0" encoding="utf-8"?>
-<w:document xmlns:wpc="http://schemas.microsoft.com/office/word/2010/wordprocessingCanvas" xmlns:mc="http://schemas.openxmlformats.org/markup-compatibility/2006" xmlns:o="urn:schemas-microsoft-com:office:office" xmlns:r="http://schemas.openxmlformats.org/officeDocument/2006/relationships" xmlns:m="http://schemas.openxmlformats.org/officeDocument/2006/math" xmlns:v="urn:schemas-microsoft-com:vml" xmlns:wp14="http://schemas.microsoft.com/office/word/2010/wordprocessingDrawing" xmlns:wp="http://schemas.openxmlformats.org/drawingml/2006/wordprocessingDrawing" xmlns:w10="urn:schemas-microsoft-com:office:word" xmlns:w="http://schemas.openxmlformats.org/wordprocessingml/2006/main" xmlns:w14="http://schemas.microsoft.com/office/word/2010/wordml" xmlns:w15="http://schemas.microsoft.com/office/word/2012/wordml" xmlns:wpg="http://schemas.microsoft.com/office/word/2010/wordprocessingGroup" xmlns:wpi="http://schemas.microsoft.com/office/word/2010/wordprocessingInk" xmlns:wne="http://schemas.microsoft.com/office/word/2006/wordml" xmlns:wps="http://schemas.microsoft.com/office/word/2010/wordprocessingShape" mc:Ignorable="w14 w15 wp14">
+<w:document xmlns:wpc="http://schemas.microsoft.com/office/word/2010/wordprocessingCanvas" xmlns:cx="http://schemas.microsoft.com/office/drawing/2014/chartex" xmlns:cx1="http://schemas.microsoft.com/office/drawing/2015/9/8/chartex" xmlns:cx2="http://schemas.microsoft.com/office/drawing/2015/10/21/chartex" xmlns:cx3="http://schemas.microsoft.com/office/drawing/2016/5/9/chartex" xmlns:cx4="http://schemas.microsoft.com/office/drawing/2016/5/10/chartex" xmlns:cx5="http://schemas.microsoft.com/office/drawing/2016/5/11/chartex" xmlns:cx6="http://schemas.microsoft.com/office/drawing/2016/5/12/chartex" xmlns:cx7="http://schemas.microsoft.com/office/drawing/2016/5/13/chartex" xmlns:cx8="http://schemas.microsoft.com/office/drawing/2016/5/14/chartex" xmlns:mc="http://schemas.openxmlformats.org/markup-compatibility/2006" xmlns:aink="http://schemas.microsoft.com/office/drawing/2016/ink" xmlns:am3d="http://schemas.microsoft.com/office/drawing/2017/model3d" xmlns:o="urn:schemas-microsoft-com:office:office" xmlns:r="http://schemas.openxmlformats.org/officeDocument/2006/relationships" xmlns:m="http://schemas.openxmlformats.org/officeDocument/2006/math" xmlns:v="urn:schemas-microsoft-com:vml" xmlns:wp14="http://schemas.microsoft.com/office/word/2010/wordprocessingDrawing" xmlns:wp="http://schemas.openxmlformats.org/drawingml/2006/wordprocessingDrawing" xmlns:w10="urn:schemas-microsoft-com:office:word" xmlns:w="http://schemas.openxmlformats.org/wordprocessingml/2006/main" xmlns:w14="http://schemas.microsoft.com/office/word/2010/wordml" xmlns:w15="http://schemas.microsoft.com/office/word/2012/wordml" xmlns:w16cex="http://schemas.microsoft.com/office/word/2018/wordml/cex" xmlns:w16cid="http://schemas.microsoft.com/office/word/2016/wordml/cid" xmlns:w16="http://schemas.microsoft.com/office/word/2018/wordml" xmlns:w16sdtdh="http://schemas.microsoft.com/office/word/2020/wordml/sdtdatahash" xmlns:w16se="http://schemas.microsoft.com/office/word/2015/wordml/symex" xmlns:wpg="http://schemas.microsoft.com/office/word/2010/wordprocessingGroup" xmlns:wpi="http://schemas.microsoft.com/office/word/2010/wordprocessingInk" xmlns:wne="http://schemas.microsoft.com/office/word/2006/wordml" xmlns:wps="http://schemas.microsoft.com/office/word/2010/wordprocessingShape" mc:Ignorable="w14 w15 w16se w16cid w16 w16cex w16sdtdh wp14">
   <w:background w:color="FFFFF0"/>
   <w:body>
     <w:p>
@@ -49,8 +49,6 @@
       <w:r>
         <w:t>Mithilfe des klassischen Algorithmus „Sieb des Eratosthenes“ (ca. 300 v. Chr.) sollen alle Primzahlen (i.e. eine ganze Zahl, die nur durch sich selbst und durch 1 teilbar ist) bis zu einer einzugebenden Obergrenze bestimmt werden.</w:t>
       </w:r>
-      <w:bookmarkStart w:id="0" w:name="_GoBack"/>
-      <w:bookmarkEnd w:id="0"/>
     </w:p>
     <w:p>
       <w:pPr>
@@ -58,14 +56,6 @@
       </w:pPr>
       <w:r>
         <w:t>Da das mit Divisionen sehr aufwändig ist, hatte Eratosthenes folgende Idee: Man schreibt die Zahlen von 1 bis zur Obergrenze auf. Dann streicht man daraus die Vielfachen von 2, 3, 5 usw. bis zur Quadratwurzel aus der Obergrenze. Die nicht gestrichenen Zahlen sind am Ende dann die Primzahlen.</w:t>
-      </w:r>
-    </w:p>
-    <w:p>
-      <w:pPr>
-        <w:jc w:val="both"/>
-      </w:pPr>
-      <w:r>
-        <w:t xml:space="preserve">Entwickeln Sie den Algorithmus mit PAP-Designer als PAP und ein C#-Programm, das diese Funktion automatisiert. </w:t>
       </w:r>
     </w:p>
     <w:p>
@@ -185,7 +175,7 @@
           <w:lang w:val="de-AT" w:eastAsia="de-AT"/>
         </w:rPr>
         <w:drawing>
-          <wp:inline distT="0" distB="0" distL="0" distR="0" wp14:anchorId="322441BB" wp14:editId="1988BBB4">
+          <wp:inline distT="0" distB="0" distL="0" distR="0" wp14:anchorId="5BFDC18A" wp14:editId="30F6AF8A">
             <wp:extent cx="4044950" cy="3225811"/>
             <wp:effectExtent l="0" t="0" r="0" b="0"/>
             <wp:docPr id="2" name="Grafik 2"/>
@@ -234,7 +224,7 @@
 </file>
 
 <file path=word/endnotes.xml><?xml version="1.0" encoding="utf-8"?>
-<w:endnotes xmlns:wpc="http://schemas.microsoft.com/office/word/2010/wordprocessingCanvas" xmlns:mc="http://schemas.openxmlformats.org/markup-compatibility/2006" xmlns:o="urn:schemas-microsoft-com:office:office" xmlns:r="http://schemas.openxmlformats.org/officeDocument/2006/relationships" xmlns:m="http://schemas.openxmlformats.org/officeDocument/2006/math" xmlns:v="urn:schemas-microsoft-com:vml" xmlns:wp14="http://schemas.microsoft.com/office/word/2010/wordprocessingDrawing" xmlns:wp="http://schemas.openxmlformats.org/drawingml/2006/wordprocessingDrawing" xmlns:w10="urn:schemas-microsoft-com:office:word" xmlns:w="http://schemas.openxmlformats.org/wordprocessingml/2006/main" xmlns:w14="http://schemas.microsoft.com/office/word/2010/wordml" xmlns:w15="http://schemas.microsoft.com/office/word/2012/wordml" xmlns:wpg="http://schemas.microsoft.com/office/word/2010/wordprocessingGroup" xmlns:wpi="http://schemas.microsoft.com/office/word/2010/wordprocessingInk" xmlns:wne="http://schemas.microsoft.com/office/word/2006/wordml" xmlns:wps="http://schemas.microsoft.com/office/word/2010/wordprocessingShape" mc:Ignorable="w14 w15 wp14">
+<w:endnotes xmlns:wpc="http://schemas.microsoft.com/office/word/2010/wordprocessingCanvas" xmlns:cx="http://schemas.microsoft.com/office/drawing/2014/chartex" xmlns:cx1="http://schemas.microsoft.com/office/drawing/2015/9/8/chartex" xmlns:cx2="http://schemas.microsoft.com/office/drawing/2015/10/21/chartex" xmlns:cx3="http://schemas.microsoft.com/office/drawing/2016/5/9/chartex" xmlns:cx4="http://schemas.microsoft.com/office/drawing/2016/5/10/chartex" xmlns:cx5="http://schemas.microsoft.com/office/drawing/2016/5/11/chartex" xmlns:cx6="http://schemas.microsoft.com/office/drawing/2016/5/12/chartex" xmlns:cx7="http://schemas.microsoft.com/office/drawing/2016/5/13/chartex" xmlns:cx8="http://schemas.microsoft.com/office/drawing/2016/5/14/chartex" xmlns:mc="http://schemas.openxmlformats.org/markup-compatibility/2006" xmlns:aink="http://schemas.microsoft.com/office/drawing/2016/ink" xmlns:am3d="http://schemas.microsoft.com/office/drawing/2017/model3d" xmlns:o="urn:schemas-microsoft-com:office:office" xmlns:r="http://schemas.openxmlformats.org/officeDocument/2006/relationships" xmlns:m="http://schemas.openxmlformats.org/officeDocument/2006/math" xmlns:v="urn:schemas-microsoft-com:vml" xmlns:wp14="http://schemas.microsoft.com/office/word/2010/wordprocessingDrawing" xmlns:wp="http://schemas.openxmlformats.org/drawingml/2006/wordprocessingDrawing" xmlns:w10="urn:schemas-microsoft-com:office:word" xmlns:w="http://schemas.openxmlformats.org/wordprocessingml/2006/main" xmlns:w14="http://schemas.microsoft.com/office/word/2010/wordml" xmlns:w15="http://schemas.microsoft.com/office/word/2012/wordml" xmlns:w16cex="http://schemas.microsoft.com/office/word/2018/wordml/cex" xmlns:w16cid="http://schemas.microsoft.com/office/word/2016/wordml/cid" xmlns:w16="http://schemas.microsoft.com/office/word/2018/wordml" xmlns:w16sdtdh="http://schemas.microsoft.com/office/word/2020/wordml/sdtdatahash" xmlns:w16se="http://schemas.microsoft.com/office/word/2015/wordml/symex" xmlns:wpg="http://schemas.microsoft.com/office/word/2010/wordprocessingGroup" xmlns:wpi="http://schemas.microsoft.com/office/word/2010/wordprocessingInk" xmlns:wne="http://schemas.microsoft.com/office/word/2006/wordml" xmlns:wps="http://schemas.microsoft.com/office/word/2010/wordprocessingShape" mc:Ignorable="w14 w15 w16se w16cid w16 w16cex w16sdtdh wp14">
   <w:endnote w:type="separator" w:id="-1">
     <w:p>
       <w:r>
@@ -255,7 +245,7 @@
 </file>
 
 <file path=word/footnotes.xml><?xml version="1.0" encoding="utf-8"?>
-<w:footnotes xmlns:wpc="http://schemas.microsoft.com/office/word/2010/wordprocessingCanvas" xmlns:mc="http://schemas.openxmlformats.org/markup-compatibility/2006" xmlns:o="urn:schemas-microsoft-com:office:office" xmlns:r="http://schemas.openxmlformats.org/officeDocument/2006/relationships" xmlns:m="http://schemas.openxmlformats.org/officeDocument/2006/math" xmlns:v="urn:schemas-microsoft-com:vml" xmlns:wp14="http://schemas.microsoft.com/office/word/2010/wordprocessingDrawing" xmlns:wp="http://schemas.openxmlformats.org/drawingml/2006/wordprocessingDrawing" xmlns:w10="urn:schemas-microsoft-com:office:word" xmlns:w="http://schemas.openxmlformats.org/wordprocessingml/2006/main" xmlns:w14="http://schemas.microsoft.com/office/word/2010/wordml" xmlns:w15="http://schemas.microsoft.com/office/word/2012/wordml" xmlns:wpg="http://schemas.microsoft.com/office/word/2010/wordprocessingGroup" xmlns:wpi="http://schemas.microsoft.com/office/word/2010/wordprocessingInk" xmlns:wne="http://schemas.microsoft.com/office/word/2006/wordml" xmlns:wps="http://schemas.microsoft.com/office/word/2010/wordprocessingShape" mc:Ignorable="w14 w15 wp14">
+<w:footnotes xmlns:wpc="http://schemas.microsoft.com/office/word/2010/wordprocessingCanvas" xmlns:cx="http://schemas.microsoft.com/office/drawing/2014/chartex" xmlns:cx1="http://schemas.microsoft.com/office/drawing/2015/9/8/chartex" xmlns:cx2="http://schemas.microsoft.com/office/drawing/2015/10/21/chartex" xmlns:cx3="http://schemas.microsoft.com/office/drawing/2016/5/9/chartex" xmlns:cx4="http://schemas.microsoft.com/office/drawing/2016/5/10/chartex" xmlns:cx5="http://schemas.microsoft.com/office/drawing/2016/5/11/chartex" xmlns:cx6="http://schemas.microsoft.com/office/drawing/2016/5/12/chartex" xmlns:cx7="http://schemas.microsoft.com/office/drawing/2016/5/13/chartex" xmlns:cx8="http://schemas.microsoft.com/office/drawing/2016/5/14/chartex" xmlns:mc="http://schemas.openxmlformats.org/markup-compatibility/2006" xmlns:aink="http://schemas.microsoft.com/office/drawing/2016/ink" xmlns:am3d="http://schemas.microsoft.com/office/drawing/2017/model3d" xmlns:o="urn:schemas-microsoft-com:office:office" xmlns:r="http://schemas.openxmlformats.org/officeDocument/2006/relationships" xmlns:m="http://schemas.openxmlformats.org/officeDocument/2006/math" xmlns:v="urn:schemas-microsoft-com:vml" xmlns:wp14="http://schemas.microsoft.com/office/word/2010/wordprocessingDrawing" xmlns:wp="http://schemas.openxmlformats.org/drawingml/2006/wordprocessingDrawing" xmlns:w10="urn:schemas-microsoft-com:office:word" xmlns:w="http://schemas.openxmlformats.org/wordprocessingml/2006/main" xmlns:w14="http://schemas.microsoft.com/office/word/2010/wordml" xmlns:w15="http://schemas.microsoft.com/office/word/2012/wordml" xmlns:w16cex="http://schemas.microsoft.com/office/word/2018/wordml/cex" xmlns:w16cid="http://schemas.microsoft.com/office/word/2016/wordml/cid" xmlns:w16="http://schemas.microsoft.com/office/word/2018/wordml" xmlns:w16sdtdh="http://schemas.microsoft.com/office/word/2020/wordml/sdtdatahash" xmlns:w16se="http://schemas.microsoft.com/office/word/2015/wordml/symex" xmlns:wpg="http://schemas.microsoft.com/office/word/2010/wordprocessingGroup" xmlns:wpi="http://schemas.microsoft.com/office/word/2010/wordprocessingInk" xmlns:wne="http://schemas.microsoft.com/office/word/2006/wordml" xmlns:wps="http://schemas.microsoft.com/office/word/2010/wordprocessingShape" mc:Ignorable="w14 w15 w16se w16cid w16 w16cex w16sdtdh wp14">
   <w:footnote w:type="separator" w:id="-1">
     <w:p>
       <w:r>
@@ -276,7 +266,7 @@
 </file>
 
 <file path=word/header1.xml><?xml version="1.0" encoding="utf-8"?>
-<w:hdr xmlns:wpc="http://schemas.microsoft.com/office/word/2010/wordprocessingCanvas" xmlns:mc="http://schemas.openxmlformats.org/markup-compatibility/2006" xmlns:o="urn:schemas-microsoft-com:office:office" xmlns:r="http://schemas.openxmlformats.org/officeDocument/2006/relationships" xmlns:m="http://schemas.openxmlformats.org/officeDocument/2006/math" xmlns:v="urn:schemas-microsoft-com:vml" xmlns:wp14="http://schemas.microsoft.com/office/word/2010/wordprocessingDrawing" xmlns:wp="http://schemas.openxmlformats.org/drawingml/2006/wordprocessingDrawing" xmlns:w10="urn:schemas-microsoft-com:office:word" xmlns:w="http://schemas.openxmlformats.org/wordprocessingml/2006/main" xmlns:w14="http://schemas.microsoft.com/office/word/2010/wordml" xmlns:w15="http://schemas.microsoft.com/office/word/2012/wordml" xmlns:wpg="http://schemas.microsoft.com/office/word/2010/wordprocessingGroup" xmlns:wpi="http://schemas.microsoft.com/office/word/2010/wordprocessingInk" xmlns:wne="http://schemas.microsoft.com/office/word/2006/wordml" xmlns:wps="http://schemas.microsoft.com/office/word/2010/wordprocessingShape" mc:Ignorable="w14 w15 wp14">
+<w:hdr xmlns:wpc="http://schemas.microsoft.com/office/word/2010/wordprocessingCanvas" xmlns:cx="http://schemas.microsoft.com/office/drawing/2014/chartex" xmlns:cx1="http://schemas.microsoft.com/office/drawing/2015/9/8/chartex" xmlns:cx2="http://schemas.microsoft.com/office/drawing/2015/10/21/chartex" xmlns:cx3="http://schemas.microsoft.com/office/drawing/2016/5/9/chartex" xmlns:cx4="http://schemas.microsoft.com/office/drawing/2016/5/10/chartex" xmlns:cx5="http://schemas.microsoft.com/office/drawing/2016/5/11/chartex" xmlns:cx6="http://schemas.microsoft.com/office/drawing/2016/5/12/chartex" xmlns:cx7="http://schemas.microsoft.com/office/drawing/2016/5/13/chartex" xmlns:cx8="http://schemas.microsoft.com/office/drawing/2016/5/14/chartex" xmlns:mc="http://schemas.openxmlformats.org/markup-compatibility/2006" xmlns:aink="http://schemas.microsoft.com/office/drawing/2016/ink" xmlns:am3d="http://schemas.microsoft.com/office/drawing/2017/model3d" xmlns:o="urn:schemas-microsoft-com:office:office" xmlns:r="http://schemas.openxmlformats.org/officeDocument/2006/relationships" xmlns:m="http://schemas.openxmlformats.org/officeDocument/2006/math" xmlns:v="urn:schemas-microsoft-com:vml" xmlns:wp14="http://schemas.microsoft.com/office/word/2010/wordprocessingDrawing" xmlns:wp="http://schemas.openxmlformats.org/drawingml/2006/wordprocessingDrawing" xmlns:w10="urn:schemas-microsoft-com:office:word" xmlns:w="http://schemas.openxmlformats.org/wordprocessingml/2006/main" xmlns:w14="http://schemas.microsoft.com/office/word/2010/wordml" xmlns:w15="http://schemas.microsoft.com/office/word/2012/wordml" xmlns:w16cex="http://schemas.microsoft.com/office/word/2018/wordml/cex" xmlns:w16cid="http://schemas.microsoft.com/office/word/2016/wordml/cid" xmlns:w16="http://schemas.microsoft.com/office/word/2018/wordml" xmlns:w16sdtdh="http://schemas.microsoft.com/office/word/2020/wordml/sdtdatahash" xmlns:w16se="http://schemas.microsoft.com/office/word/2015/wordml/symex" xmlns:wpg="http://schemas.microsoft.com/office/word/2010/wordprocessingGroup" xmlns:wpi="http://schemas.microsoft.com/office/word/2010/wordprocessingInk" xmlns:wne="http://schemas.microsoft.com/office/word/2006/wordml" xmlns:wps="http://schemas.microsoft.com/office/word/2010/wordprocessingShape" mc:Ignorable="w14 w15 w16se w16cid w16 w16cex w16sdtdh wp14">
   <w:p>
     <w:pPr>
       <w:framePr w:w="528" w:wrap="around" w:vAnchor="text" w:hAnchor="page" w:x="10162" w:y="-18"/>
@@ -316,7 +306,7 @@
 </file>
 
 <file path=word/header2.xml><?xml version="1.0" encoding="utf-8"?>
-<w:hdr xmlns:wpc="http://schemas.microsoft.com/office/word/2010/wordprocessingCanvas" xmlns:mc="http://schemas.openxmlformats.org/markup-compatibility/2006" xmlns:o="urn:schemas-microsoft-com:office:office" xmlns:r="http://schemas.openxmlformats.org/officeDocument/2006/relationships" xmlns:m="http://schemas.openxmlformats.org/officeDocument/2006/math" xmlns:v="urn:schemas-microsoft-com:vml" xmlns:wp14="http://schemas.microsoft.com/office/word/2010/wordprocessingDrawing" xmlns:wp="http://schemas.openxmlformats.org/drawingml/2006/wordprocessingDrawing" xmlns:w10="urn:schemas-microsoft-com:office:word" xmlns:w="http://schemas.openxmlformats.org/wordprocessingml/2006/main" xmlns:w14="http://schemas.microsoft.com/office/word/2010/wordml" xmlns:w15="http://schemas.microsoft.com/office/word/2012/wordml" xmlns:wpg="http://schemas.microsoft.com/office/word/2010/wordprocessingGroup" xmlns:wpi="http://schemas.microsoft.com/office/word/2010/wordprocessingInk" xmlns:wne="http://schemas.microsoft.com/office/word/2006/wordml" xmlns:wps="http://schemas.microsoft.com/office/word/2010/wordprocessingShape" mc:Ignorable="w14 w15 wp14">
+<w:hdr xmlns:wpc="http://schemas.microsoft.com/office/word/2010/wordprocessingCanvas" xmlns:cx="http://schemas.microsoft.com/office/drawing/2014/chartex" xmlns:cx1="http://schemas.microsoft.com/office/drawing/2015/9/8/chartex" xmlns:cx2="http://schemas.microsoft.com/office/drawing/2015/10/21/chartex" xmlns:cx3="http://schemas.microsoft.com/office/drawing/2016/5/9/chartex" xmlns:cx4="http://schemas.microsoft.com/office/drawing/2016/5/10/chartex" xmlns:cx5="http://schemas.microsoft.com/office/drawing/2016/5/11/chartex" xmlns:cx6="http://schemas.microsoft.com/office/drawing/2016/5/12/chartex" xmlns:cx7="http://schemas.microsoft.com/office/drawing/2016/5/13/chartex" xmlns:cx8="http://schemas.microsoft.com/office/drawing/2016/5/14/chartex" xmlns:mc="http://schemas.openxmlformats.org/markup-compatibility/2006" xmlns:aink="http://schemas.microsoft.com/office/drawing/2016/ink" xmlns:am3d="http://schemas.microsoft.com/office/drawing/2017/model3d" xmlns:o="urn:schemas-microsoft-com:office:office" xmlns:r="http://schemas.openxmlformats.org/officeDocument/2006/relationships" xmlns:m="http://schemas.openxmlformats.org/officeDocument/2006/math" xmlns:v="urn:schemas-microsoft-com:vml" xmlns:wp14="http://schemas.microsoft.com/office/word/2010/wordprocessingDrawing" xmlns:wp="http://schemas.openxmlformats.org/drawingml/2006/wordprocessingDrawing" xmlns:w10="urn:schemas-microsoft-com:office:word" xmlns:w="http://schemas.openxmlformats.org/wordprocessingml/2006/main" xmlns:w14="http://schemas.microsoft.com/office/word/2010/wordml" xmlns:w15="http://schemas.microsoft.com/office/word/2012/wordml" xmlns:w16cex="http://schemas.microsoft.com/office/word/2018/wordml/cex" xmlns:w16cid="http://schemas.microsoft.com/office/word/2016/wordml/cid" xmlns:w16="http://schemas.microsoft.com/office/word/2018/wordml" xmlns:w16sdtdh="http://schemas.microsoft.com/office/word/2020/wordml/sdtdatahash" xmlns:w16se="http://schemas.microsoft.com/office/word/2015/wordml/symex" xmlns:wpg="http://schemas.microsoft.com/office/word/2010/wordprocessingGroup" xmlns:wpi="http://schemas.microsoft.com/office/word/2010/wordprocessingInk" xmlns:wne="http://schemas.microsoft.com/office/word/2006/wordml" xmlns:wps="http://schemas.microsoft.com/office/word/2010/wordprocessingShape" mc:Ignorable="w14 w15 w16se w16cid w16 w16cex w16sdtdh wp14">
   <w:p>
     <w:pPr>
       <w:framePr w:w="528" w:wrap="around" w:vAnchor="text" w:hAnchor="page" w:x="10162" w:y="1"/>
@@ -347,23 +337,38 @@
         <w:bottom w:val="single" w:sz="4" w:space="1" w:color="auto"/>
       </w:pBdr>
     </w:pPr>
-    <w:fldSimple w:instr=" STYLEREF  &quot;Überschrift 2&quot;  \* MERGEFORMAT ">
-      <w:r>
-        <w:rPr>
-          <w:b/>
-          <w:bCs/>
-          <w:noProof/>
-        </w:rPr>
-        <w:t>Lehrziele:</w:t>
-      </w:r>
-    </w:fldSimple>
+    <w:r>
+      <w:fldChar w:fldCharType="begin"/>
+    </w:r>
+    <w:r>
+      <w:instrText xml:space="preserve"> STYLEREF  "Überschrift 2"  \* MERGEFORMAT </w:instrText>
+    </w:r>
+    <w:r>
+      <w:fldChar w:fldCharType="separate"/>
+    </w:r>
+    <w:r>
+      <w:rPr>
+        <w:b/>
+        <w:bCs/>
+        <w:noProof/>
+      </w:rPr>
+      <w:t>Lehrziele:</w:t>
+    </w:r>
+    <w:r>
+      <w:rPr>
+        <w:b/>
+        <w:bCs/>
+        <w:noProof/>
+      </w:rPr>
+      <w:fldChar w:fldCharType="end"/>
+    </w:r>
   </w:p>
   <w:p/>
 </w:hdr>
 </file>
 
 <file path=word/numbering.xml><?xml version="1.0" encoding="utf-8"?>
-<w:numbering xmlns:wpc="http://schemas.microsoft.com/office/word/2010/wordprocessingCanvas" xmlns:mc="http://schemas.openxmlformats.org/markup-compatibility/2006" xmlns:o="urn:schemas-microsoft-com:office:office" xmlns:r="http://schemas.openxmlformats.org/officeDocument/2006/relationships" xmlns:m="http://schemas.openxmlformats.org/officeDocument/2006/math" xmlns:v="urn:schemas-microsoft-com:vml" xmlns:wp14="http://schemas.microsoft.com/office/word/2010/wordprocessingDrawing" xmlns:wp="http://schemas.openxmlformats.org/drawingml/2006/wordprocessingDrawing" xmlns:w10="urn:schemas-microsoft-com:office:word" xmlns:w="http://schemas.openxmlformats.org/wordprocessingml/2006/main" xmlns:w14="http://schemas.microsoft.com/office/word/2010/wordml" xmlns:w15="http://schemas.microsoft.com/office/word/2012/wordml" xmlns:wpg="http://schemas.microsoft.com/office/word/2010/wordprocessingGroup" xmlns:wpi="http://schemas.microsoft.com/office/word/2010/wordprocessingInk" xmlns:wne="http://schemas.microsoft.com/office/word/2006/wordml" xmlns:wps="http://schemas.microsoft.com/office/word/2010/wordprocessingShape" mc:Ignorable="w14 w15 wp14">
+<w:numbering xmlns:wpc="http://schemas.microsoft.com/office/word/2010/wordprocessingCanvas" xmlns:cx="http://schemas.microsoft.com/office/drawing/2014/chartex" xmlns:cx1="http://schemas.microsoft.com/office/drawing/2015/9/8/chartex" xmlns:cx2="http://schemas.microsoft.com/office/drawing/2015/10/21/chartex" xmlns:cx3="http://schemas.microsoft.com/office/drawing/2016/5/9/chartex" xmlns:cx4="http://schemas.microsoft.com/office/drawing/2016/5/10/chartex" xmlns:cx5="http://schemas.microsoft.com/office/drawing/2016/5/11/chartex" xmlns:cx6="http://schemas.microsoft.com/office/drawing/2016/5/12/chartex" xmlns:cx7="http://schemas.microsoft.com/office/drawing/2016/5/13/chartex" xmlns:cx8="http://schemas.microsoft.com/office/drawing/2016/5/14/chartex" xmlns:mc="http://schemas.openxmlformats.org/markup-compatibility/2006" xmlns:aink="http://schemas.microsoft.com/office/drawing/2016/ink" xmlns:am3d="http://schemas.microsoft.com/office/drawing/2017/model3d" xmlns:o="urn:schemas-microsoft-com:office:office" xmlns:r="http://schemas.openxmlformats.org/officeDocument/2006/relationships" xmlns:m="http://schemas.openxmlformats.org/officeDocument/2006/math" xmlns:v="urn:schemas-microsoft-com:vml" xmlns:wp14="http://schemas.microsoft.com/office/word/2010/wordprocessingDrawing" xmlns:wp="http://schemas.openxmlformats.org/drawingml/2006/wordprocessingDrawing" xmlns:w10="urn:schemas-microsoft-com:office:word" xmlns:w="http://schemas.openxmlformats.org/wordprocessingml/2006/main" xmlns:w14="http://schemas.microsoft.com/office/word/2010/wordml" xmlns:w15="http://schemas.microsoft.com/office/word/2012/wordml" xmlns:w16cex="http://schemas.microsoft.com/office/word/2018/wordml/cex" xmlns:w16cid="http://schemas.microsoft.com/office/word/2016/wordml/cid" xmlns:w16="http://schemas.microsoft.com/office/word/2018/wordml" xmlns:w16sdtdh="http://schemas.microsoft.com/office/word/2020/wordml/sdtdatahash" xmlns:w16se="http://schemas.microsoft.com/office/word/2015/wordml/symex" xmlns:wpg="http://schemas.microsoft.com/office/word/2010/wordprocessingGroup" xmlns:wpi="http://schemas.microsoft.com/office/word/2010/wordprocessingInk" xmlns:wne="http://schemas.microsoft.com/office/word/2006/wordml" xmlns:wps="http://schemas.microsoft.com/office/word/2010/wordprocessingShape" mc:Ignorable="w14 w15 w16se w16cid w16 w16cex w16sdtdh wp14">
   <w:abstractNum w:abstractNumId="0" w15:restartNumberingAfterBreak="0">
     <w:nsid w:val="FFFFFF7C"/>
     <w:multiLevelType w:val="singleLevel"/>
@@ -2347,7 +2352,7 @@
 </file>
 
 <file path=word/styles.xml><?xml version="1.0" encoding="utf-8"?>
-<w:styles xmlns:mc="http://schemas.openxmlformats.org/markup-compatibility/2006" xmlns:r="http://schemas.openxmlformats.org/officeDocument/2006/relationships" xmlns:w="http://schemas.openxmlformats.org/wordprocessingml/2006/main" xmlns:w14="http://schemas.microsoft.com/office/word/2010/wordml" xmlns:w15="http://schemas.microsoft.com/office/word/2012/wordml" mc:Ignorable="w14 w15">
+<w:styles xmlns:mc="http://schemas.openxmlformats.org/markup-compatibility/2006" xmlns:r="http://schemas.openxmlformats.org/officeDocument/2006/relationships" xmlns:w="http://schemas.openxmlformats.org/wordprocessingml/2006/main" xmlns:w14="http://schemas.microsoft.com/office/word/2010/wordml" xmlns:w15="http://schemas.microsoft.com/office/word/2012/wordml" xmlns:w16cex="http://schemas.microsoft.com/office/word/2018/wordml/cex" xmlns:w16cid="http://schemas.microsoft.com/office/word/2016/wordml/cid" xmlns:w16="http://schemas.microsoft.com/office/word/2018/wordml" xmlns:w16sdtdh="http://schemas.microsoft.com/office/word/2020/wordml/sdtdatahash" xmlns:w16se="http://schemas.microsoft.com/office/word/2015/wordml/symex" mc:Ignorable="w14 w15 w16se w16cid w16 w16cex w16sdtdh">
   <w:docDefaults>
     <w:rPrDefault>
       <w:rPr>
@@ -2357,7 +2362,7 @@
     </w:rPrDefault>
     <w:pPrDefault/>
   </w:docDefaults>
-  <w:latentStyles w:defLockedState="0" w:defUIPriority="0" w:defSemiHidden="0" w:defUnhideWhenUsed="0" w:defQFormat="0" w:count="371">
+  <w:latentStyles w:defLockedState="0" w:defUIPriority="0" w:defSemiHidden="0" w:defUnhideWhenUsed="0" w:defQFormat="0" w:count="376">
     <w:lsdException w:name="Normal" w:qFormat="1"/>
     <w:lsdException w:name="heading 1" w:qFormat="1"/>
     <w:lsdException w:name="heading 2" w:qFormat="1"/>
@@ -2373,6 +2378,53 @@
     <w:lsdException w:name="Subtitle" w:qFormat="1"/>
     <w:lsdException w:name="Strong" w:qFormat="1"/>
     <w:lsdException w:name="Emphasis" w:qFormat="1"/>
+    <w:lsdException w:name="HTML Keyboard" w:semiHidden="1" w:unhideWhenUsed="1"/>
+    <w:lsdException w:name="annotation subject" w:semiHidden="1" w:unhideWhenUsed="1"/>
+    <w:lsdException w:name="No List" w:semiHidden="1" w:unhideWhenUsed="1"/>
+    <w:lsdException w:name="Outline List 1" w:semiHidden="1" w:unhideWhenUsed="1"/>
+    <w:lsdException w:name="Outline List 2" w:semiHidden="1" w:unhideWhenUsed="1"/>
+    <w:lsdException w:name="Outline List 3" w:semiHidden="1" w:unhideWhenUsed="1"/>
+    <w:lsdException w:name="Table Simple 1" w:semiHidden="1" w:unhideWhenUsed="1"/>
+    <w:lsdException w:name="Table Simple 2" w:semiHidden="1" w:unhideWhenUsed="1"/>
+    <w:lsdException w:name="Table Simple 3" w:semiHidden="1" w:unhideWhenUsed="1"/>
+    <w:lsdException w:name="Table Classic 1" w:semiHidden="1" w:unhideWhenUsed="1"/>
+    <w:lsdException w:name="Table Classic 2" w:semiHidden="1" w:unhideWhenUsed="1"/>
+    <w:lsdException w:name="Table Classic 3" w:semiHidden="1" w:unhideWhenUsed="1"/>
+    <w:lsdException w:name="Table Classic 4" w:semiHidden="1" w:unhideWhenUsed="1"/>
+    <w:lsdException w:name="Table Colorful 1" w:semiHidden="1" w:unhideWhenUsed="1"/>
+    <w:lsdException w:name="Table Colorful 2" w:semiHidden="1" w:unhideWhenUsed="1"/>
+    <w:lsdException w:name="Table Colorful 3" w:semiHidden="1" w:unhideWhenUsed="1"/>
+    <w:lsdException w:name="Table Columns 1" w:semiHidden="1" w:unhideWhenUsed="1"/>
+    <w:lsdException w:name="Table Columns 2" w:semiHidden="1" w:unhideWhenUsed="1"/>
+    <w:lsdException w:name="Table Columns 3" w:semiHidden="1" w:unhideWhenUsed="1"/>
+    <w:lsdException w:name="Table Columns 4" w:semiHidden="1" w:unhideWhenUsed="1"/>
+    <w:lsdException w:name="Table Columns 5" w:semiHidden="1" w:unhideWhenUsed="1"/>
+    <w:lsdException w:name="Table Grid 1" w:semiHidden="1" w:unhideWhenUsed="1"/>
+    <w:lsdException w:name="Table Grid 2" w:semiHidden="1" w:unhideWhenUsed="1"/>
+    <w:lsdException w:name="Table Grid 3" w:semiHidden="1" w:unhideWhenUsed="1"/>
+    <w:lsdException w:name="Table Grid 4" w:semiHidden="1" w:unhideWhenUsed="1"/>
+    <w:lsdException w:name="Table Grid 5" w:semiHidden="1" w:unhideWhenUsed="1"/>
+    <w:lsdException w:name="Table Grid 6" w:semiHidden="1" w:unhideWhenUsed="1"/>
+    <w:lsdException w:name="Table Grid 7" w:semiHidden="1" w:unhideWhenUsed="1"/>
+    <w:lsdException w:name="Table Grid 8" w:semiHidden="1" w:unhideWhenUsed="1"/>
+    <w:lsdException w:name="Table List 1" w:semiHidden="1" w:unhideWhenUsed="1"/>
+    <w:lsdException w:name="Table List 2" w:semiHidden="1" w:unhideWhenUsed="1"/>
+    <w:lsdException w:name="Table List 3" w:semiHidden="1" w:unhideWhenUsed="1"/>
+    <w:lsdException w:name="Table List 4" w:semiHidden="1" w:unhideWhenUsed="1"/>
+    <w:lsdException w:name="Table List 5" w:semiHidden="1" w:unhideWhenUsed="1"/>
+    <w:lsdException w:name="Table List 6" w:semiHidden="1" w:unhideWhenUsed="1"/>
+    <w:lsdException w:name="Table List 7" w:semiHidden="1" w:unhideWhenUsed="1"/>
+    <w:lsdException w:name="Table List 8" w:semiHidden="1" w:unhideWhenUsed="1"/>
+    <w:lsdException w:name="Table 3D effects 1" w:semiHidden="1" w:unhideWhenUsed="1"/>
+    <w:lsdException w:name="Table 3D effects 2" w:semiHidden="1" w:unhideWhenUsed="1"/>
+    <w:lsdException w:name="Table 3D effects 3" w:semiHidden="1" w:unhideWhenUsed="1"/>
+    <w:lsdException w:name="Table Contemporary" w:semiHidden="1" w:unhideWhenUsed="1"/>
+    <w:lsdException w:name="Table Elegant" w:semiHidden="1" w:unhideWhenUsed="1"/>
+    <w:lsdException w:name="Table Professional" w:semiHidden="1" w:unhideWhenUsed="1"/>
+    <w:lsdException w:name="Table Subtle 2" w:semiHidden="1" w:unhideWhenUsed="1"/>
+    <w:lsdException w:name="Table Web 1" w:semiHidden="1" w:unhideWhenUsed="1"/>
+    <w:lsdException w:name="Balloon Text" w:semiHidden="1" w:unhideWhenUsed="1"/>
+    <w:lsdException w:name="Table Theme" w:semiHidden="1" w:unhideWhenUsed="1"/>
     <w:lsdException w:name="Placeholder Text" w:semiHidden="1" w:uiPriority="99"/>
     <w:lsdException w:name="No Spacing" w:uiPriority="1" w:qFormat="1"/>
     <w:lsdException w:name="Light Shading" w:uiPriority="60"/>
@@ -2588,6 +2640,11 @@
     <w:lsdException w:name="List Table 5 Dark Accent 6" w:uiPriority="50"/>
     <w:lsdException w:name="List Table 6 Colorful Accent 6" w:uiPriority="51"/>
     <w:lsdException w:name="List Table 7 Colorful Accent 6" w:uiPriority="52"/>
+    <w:lsdException w:name="Mention" w:semiHidden="1" w:uiPriority="99" w:unhideWhenUsed="1"/>
+    <w:lsdException w:name="Smart Hyperlink" w:semiHidden="1" w:uiPriority="99" w:unhideWhenUsed="1"/>
+    <w:lsdException w:name="Hashtag" w:semiHidden="1" w:uiPriority="99" w:unhideWhenUsed="1"/>
+    <w:lsdException w:name="Unresolved Mention" w:semiHidden="1" w:uiPriority="99" w:unhideWhenUsed="1"/>
+    <w:lsdException w:name="Smart Link" w:semiHidden="1" w:uiPriority="99" w:unhideWhenUsed="1"/>
   </w:latentStyles>
   <w:style w:type="paragraph" w:default="1" w:styleId="Standard">
     <w:name w:val="Normal"/>
@@ -2800,12 +2857,15 @@
   </w:style>
   <w:style w:type="character" w:default="1" w:styleId="Absatz-Standardschriftart">
     <w:name w:val="Default Paragraph Font"/>
+    <w:uiPriority w:val="1"/>
     <w:semiHidden/>
-    <w:rsid w:val="00104AF4"/>
+    <w:unhideWhenUsed/>
   </w:style>
   <w:style w:type="table" w:default="1" w:styleId="NormaleTabelle">
     <w:name w:val="Normal Table"/>
+    <w:uiPriority w:val="99"/>
     <w:semiHidden/>
+    <w:unhideWhenUsed/>
     <w:tblPr>
       <w:tblInd w:w="0" w:type="dxa"/>
       <w:tblCellMar>
@@ -2818,8 +2878,9 @@
   </w:style>
   <w:style w:type="numbering" w:default="1" w:styleId="KeineListe">
     <w:name w:val="No List"/>
+    <w:uiPriority w:val="99"/>
     <w:semiHidden/>
-    <w:rsid w:val="00104AF4"/>
+    <w:unhideWhenUsed/>
   </w:style>
   <w:style w:type="paragraph" w:customStyle="1" w:styleId="Text">
     <w:name w:val="Text"/>
@@ -3175,7 +3236,7 @@
       <w:szCs w:val="20"/>
     </w:rPr>
   </w:style>
-  <w:style w:type="character" w:styleId="BesuchterHyperlink">
+  <w:style w:type="character" w:styleId="BesuchterLink">
     <w:name w:val="FollowedHyperlink"/>
     <w:basedOn w:val="Absatz-Standardschriftart"/>
     <w:rsid w:val="00104AF4"/>

</xml_diff>